<commit_message>
Source citations and revision.
</commit_message>
<xml_diff>
--- a/Deep Reading Empathy.docx
+++ b/Deep Reading Empathy.docx
@@ -27,6 +27,17 @@
       </w:pPr>
       <w:r>
         <w:rPr/>
+      </w:r>
+    </w:p>
+    <w:p>
+      <w:pPr>
+        <w:pStyle w:val="BodyText"/>
+        <w:bidi w:val="0"/>
+        <w:jc w:val="left"/>
+        <w:rPr/>
+      </w:pPr>
+      <w:r>
+        <w:rPr/>
         <w:t>by Dennis Mojado</w:t>
       </w:r>
     </w:p>
@@ -114,20 +125,40 @@
       </w:pPr>
       <w:r>
         <w:rPr/>
-        <w:t>Neurological studies show that the reading circuit in the brain isn't an innate structure but a flexible system that must be built through practice. Because of this plasticity, the brain adapts to the medium it uses most. When you spend the majority of your day on digital platforms, your neural pathways reorganize to favor rapid scanning and multitasking. This adaptation comes at a physical cost. Using an F-pattern to browse articles weakens the connections required for linear, deep processing. Research utilizing EEGs indicates that screen reading often triggers lower frequency brain bands like theta and alpha, which are closer to the state of daydreaming than focused analysis. Printed paper, on the other hand, activates beta and gamma bands, which signal high levels of engagement and cognitive effort.</w:t>
-      </w:r>
-    </w:p>
-    <w:p>
-      <w:pPr>
-        <w:pStyle w:val="BodyText"/>
-        <w:bidi w:val="0"/>
-        <w:ind w:hanging="0" w:left="0" w:right="0"/>
-        <w:jc w:val="left"/>
-        <w:rPr/>
-      </w:pPr>
-      <w:r>
-        <w:rPr/>
-        <w:t>Deep reading in print also supports the creation of mental maps. When you hold a physical book, your brain uses tactile and spatial markers—the weight of the volume in your hands, the texture of the paper, and the fixed location of a passage on a specific page—to anchor information in your memory. Scrolling on a screen destroys these markers. It forces the brain to process words on a moving canvas, which increases cognitive load and makes it harder to reconstruct the sequence of events or arguments. Over time, this loss of spatial grounding leads to a shallower form of comprehension where details are easily forgotten.</w:t>
+        <w:t>Neurological studies show that the reading circuit in the brain isn't an innate structure but a flexible system that must be built through practice. Because of this plasticity, the brain adapts to the medium it uses most. When you spend the majority of your day on digital platforms, your neural pathways reorganize to favor rapid scanning and multitasking. This adaptation comes at a physical cost. Using an F-pattern to browse articles weakens the connections required for linear, deep processing. Research utilizing EEGs</w:t>
+      </w:r>
+      <w:r>
+        <w:rPr>
+          <w:rStyle w:val="FootnoteReference"/>
+        </w:rPr>
+        <w:footnoteReference w:id="2"/>
+      </w:r>
+      <w:r>
+        <w:rPr/>
+        <w:t xml:space="preserve"> indicates that screen reading often triggers lower frequency brain bands like theta and alpha, which are closer to the state of daydreaming than focused analysis. Printed paper, on the other hand, activates beta and gamma bands, which signal high levels of engagement and cognitive effort.</w:t>
+      </w:r>
+    </w:p>
+    <w:p>
+      <w:pPr>
+        <w:pStyle w:val="BodyText"/>
+        <w:bidi w:val="0"/>
+        <w:ind w:hanging="0" w:left="0" w:right="0"/>
+        <w:jc w:val="left"/>
+        <w:rPr/>
+      </w:pPr>
+      <w:r>
+        <w:rPr/>
+        <w:t>Deep reading in print also supports the creation of mental maps</w:t>
+      </w:r>
+      <w:r>
+        <w:rPr>
+          <w:rStyle w:val="FootnoteReference"/>
+        </w:rPr>
+        <w:footnoteReference w:id="3"/>
+      </w:r>
+      <w:r>
+        <w:rPr/>
+        <w:t>. When you hold a physical book, your brain uses tactile and spatial markers—the weight of the volume in your hands, the texture of the paper, and the fixed location of a passage on a specific page—to anchor information in your memory. Scrolling on a screen destroys these markers. It forces the brain to process words on a moving canvas, which increases cognitive load and makes it harder to reconstruct the sequence of events or arguments. Over time, this loss of spatial grounding leads to a shallower form of comprehension where details are easily forgotten.</w:t>
       </w:r>
     </w:p>
     <w:p>
@@ -153,7 +184,17 @@
       </w:pPr>
       <w:r>
         <w:rPr/>
-        <w:t>When a reader engages with a novel, the brain does not distinguish between the fictional experience and reality as much as one might assume. Functional MRI scans show that when you read about a character performing an action or feeling an emotion, your motor and sensory cortexes fire as if you were experiencing those events yourself. This phenomenon, often called grounded cognition, allows the brain to rehearse social interactions and moral dilemmas within a safe environment. Losing the habit of deep reading means losing this mental gym where the muscles of empathy are built. Without the slow, meditative process of following a character's internal logic for hundreds of pages, the ability to understand people who hold different perspectives begins to wither.</w:t>
+        <w:t>When a reader engages with a novel, the brain does not distinguish between the fictional experience and reality as much as one might assume. Functional MRI scans</w:t>
+      </w:r>
+      <w:r>
+        <w:rPr>
+          <w:rStyle w:val="FootnoteReference"/>
+        </w:rPr>
+        <w:footnoteReference w:id="4"/>
+      </w:r>
+      <w:r>
+        <w:rPr/>
+        <w:t xml:space="preserve"> show that when you read about a character performing an action or feeling an emotion, your motor and sensory cortexes fire as if you were experiencing those events yourself. This phenomenon, often called grounded cognition, allows the brain to rehearse social interactions and moral dilemmas within a safe environment. Losing the habit of deep reading means losing this mental gym where the muscles of empathy are built. Without the slow, meditative process of following a character's internal logic for hundreds of pages, the ability to understand people who hold different perspectives begins to wither.</w:t>
       </w:r>
     </w:p>
     <w:p>
@@ -207,14 +248,23 @@
         <w:rPr/>
         <w:t>Retraining the brain for deep reading requires treating focus as a physical skill that has weakened through disuse. To reverse this atrophy, you must intentionally increase the friction between yourself and digital distractions. Research from </w:t>
       </w:r>
-      <w:hyperlink r:id="rId2" w:tgtFrame="_blank">
-        <w:r>
-          <w:rPr>
-            <w:rStyle w:val="Hyperlink"/>
-          </w:rPr>
-          <w:t>Harvard Health</w:t>
-        </w:r>
-      </w:hyperlink>
+      <w:r>
+        <w:rPr>
+          <w:rStyle w:val="Hyperlink"/>
+          <w:color w:val="auto"/>
+          <w:u w:val="none"/>
+        </w:rPr>
+        <w:t>Harvard Health</w:t>
+      </w:r>
+      <w:r>
+        <w:rPr>
+          <w:rStyle w:val="Hyperlink"/>
+          <w:rStyle w:val="FootnoteReference"/>
+          <w:color w:val="auto"/>
+          <w:u w:val="none"/>
+        </w:rPr>
+        <w:footnoteReference w:id="5"/>
+      </w:r>
       <w:r>
         <w:rPr/>
         <w:t> suggests a structured monitoring exercise where you set a timer for thirty minutes but have it alert you every five minutes. When that short alert sounds, you simply check if your mind has wandered. If it has, you gently return to the text. This practice strengthens the executive function responsible for monitoring attention and reduces the frequency of aimless drifting. Over time, these intervals can be lengthened as your cognitive stamina improves.</w:t>
@@ -232,14 +282,23 @@
         <w:rPr/>
         <w:t>Physical separation from technology is the most effective way to lower cognitive load. Even the sight of a smartphone, even if it's turned off, forces the brain to use energy resisting the urge to check it. Keeping your phone in another room while you read eliminates this silent drain on your willpower. Experts at </w:t>
       </w:r>
-      <w:hyperlink r:id="rId3" w:tgtFrame="_blank">
-        <w:r>
-          <w:rPr>
-            <w:rStyle w:val="Hyperlink"/>
-          </w:rPr>
-          <w:t>The Growth Equation</w:t>
-        </w:r>
-      </w:hyperlink>
+      <w:r>
+        <w:rPr>
+          <w:rStyle w:val="Hyperlink"/>
+          <w:color w:val="auto"/>
+          <w:u w:val="none"/>
+        </w:rPr>
+        <w:t>The Growth Equation</w:t>
+      </w:r>
+      <w:r>
+        <w:rPr>
+          <w:rStyle w:val="Hyperlink"/>
+          <w:rStyle w:val="FootnoteReference"/>
+          <w:color w:val="auto"/>
+          <w:u w:val="none"/>
+        </w:rPr>
+        <w:footnoteReference w:id="6"/>
+      </w:r>
       <w:r>
         <w:rPr/>
         <w:t> recommend using a hardcopy book specifically because its tactile nature provides spatial anchors for memory that digital screens lack. Holding the physical weight of a volume and seeing fixed paragraphs on a page helps the brain build a stable mental map of the information.</w:t>
@@ -270,14 +329,23 @@
         <w:rPr/>
         <w:t>Consistency serves as the foundation for lasting change. Habit formation usually takes several months, so starting with small, manageable blocks of time is essential. You might try reading for fifteen minutes immediately after an existing habit like drinking coffee or finishing dinner. </w:t>
       </w:r>
-      <w:hyperlink r:id="rId4" w:tgtFrame="_blank">
-        <w:r>
-          <w:rPr>
-            <w:rStyle w:val="Hyperlink"/>
-          </w:rPr>
-          <w:t>Popular Science</w:t>
-        </w:r>
-      </w:hyperlink>
+      <w:r>
+        <w:rPr>
+          <w:rStyle w:val="Hyperlink"/>
+          <w:color w:val="auto"/>
+          <w:u w:val="none"/>
+        </w:rPr>
+        <w:t>Popular Science</w:t>
+      </w:r>
+      <w:r>
+        <w:rPr>
+          <w:rStyle w:val="Hyperlink"/>
+          <w:rStyle w:val="FootnoteReference"/>
+          <w:color w:val="auto"/>
+          <w:u w:val="none"/>
+        </w:rPr>
+        <w:footnoteReference w:id="7"/>
+      </w:r>
       <w:r>
         <w:rPr/>
         <w:t> notes that tying a new behavior to an established routine makes it much easier to remember and maintain. By focusing on the process of reading rather than the speed of completion, you allow your neural pathways the time they need to rebuild the circuits of deep thought.</w:t>
@@ -311,9 +379,13 @@
       </w:r>
     </w:p>
     <w:sectPr>
+      <w:footerReference w:type="default" r:id="rId2"/>
+      <w:footnotePr>
+        <w:numFmt w:val="decimal"/>
+      </w:footnotePr>
       <w:type w:val="nextPage"/>
       <w:pgSz w:w="12240" w:h="15840"/>
-      <w:pgMar w:left="1134" w:right="1134" w:gutter="0" w:header="0" w:top="1134" w:footer="0" w:bottom="1134"/>
+      <w:pgMar w:left="1134" w:right="1134" w:gutter="0" w:header="0" w:top="1134" w:footer="1134" w:bottom="1648"/>
       <w:pgNumType w:fmt="decimal"/>
       <w:formProt w:val="false"/>
       <w:textDirection w:val="lrTb"/>
@@ -323,6 +395,272 @@
 </w:document>
 </file>
 
+<file path=word/footer1.xml><?xml version="1.0" encoding="utf-8"?>
+<w:ftr xmlns:o="urn:schemas-microsoft-com:office:office" xmlns:r="http://schemas.openxmlformats.org/officeDocument/2006/relationships" xmlns:v="urn:schemas-microsoft-com:vml" xmlns:w="http://schemas.openxmlformats.org/wordprocessingml/2006/main" xmlns:w10="urn:schemas-microsoft-com:office:word" xmlns:wp="http://schemas.openxmlformats.org/drawingml/2006/wordprocessingDrawing" xmlns:pic="http://schemas.openxmlformats.org/drawingml/2006/picture" xmlns:wps="http://schemas.microsoft.com/office/word/2010/wordprocessingShape" xmlns:wpg="http://schemas.microsoft.com/office/word/2010/wordprocessingGroup" xmlns:mc="http://schemas.openxmlformats.org/markup-compatibility/2006" xmlns:wp14="http://schemas.microsoft.com/office/word/2010/wordprocessingDrawing" xmlns:w14="http://schemas.microsoft.com/office/word/2010/wordml" xmlns:w15="http://schemas.microsoft.com/office/word/2012/wordml" mc:Ignorable="w14 wp14 w15">
+  <w:p>
+    <w:pPr>
+      <w:pStyle w:val="Footer"/>
+      <w:jc w:val="center"/>
+      <w:rPr>
+        <w:sz w:val="20"/>
+        <w:szCs w:val="20"/>
+      </w:rPr>
+    </w:pPr>
+    <w:bookmarkStart w:id="0" w:name="PageNumWizard_FOOTER_Default_Page_Style3"/>
+    <w:r>
+      <w:rPr>
+        <w:sz w:val="20"/>
+        <w:szCs w:val="20"/>
+      </w:rPr>
+      <w:fldChar w:fldCharType="begin"/>
+    </w:r>
+    <w:r>
+      <w:rPr>
+        <w:sz w:val="20"/>
+        <w:szCs w:val="20"/>
+      </w:rPr>
+      <w:instrText xml:space="preserve"> PAGE </w:instrText>
+    </w:r>
+    <w:r>
+      <w:rPr>
+        <w:sz w:val="20"/>
+        <w:szCs w:val="20"/>
+      </w:rPr>
+      <w:fldChar w:fldCharType="separate"/>
+    </w:r>
+    <w:r>
+      <w:rPr>
+        <w:sz w:val="20"/>
+        <w:szCs w:val="20"/>
+      </w:rPr>
+      <w:t>1</w:t>
+    </w:r>
+    <w:r>
+      <w:rPr>
+        <w:sz w:val="20"/>
+        <w:szCs w:val="20"/>
+      </w:rPr>
+      <w:fldChar w:fldCharType="end"/>
+    </w:r>
+    <w:r>
+      <w:rPr>
+        <w:sz w:val="20"/>
+        <w:szCs w:val="20"/>
+      </w:rPr>
+      <w:t xml:space="preserve"> </w:t>
+    </w:r>
+    <w:r>
+      <w:rPr>
+        <w:sz w:val="20"/>
+        <w:szCs w:val="20"/>
+      </w:rPr>
+      <w:t xml:space="preserve">/ </w:t>
+    </w:r>
+    <w:r>
+      <w:rPr>
+        <w:sz w:val="20"/>
+        <w:szCs w:val="20"/>
+      </w:rPr>
+      <w:fldChar w:fldCharType="begin"/>
+    </w:r>
+    <w:r>
+      <w:rPr>
+        <w:sz w:val="20"/>
+        <w:szCs w:val="20"/>
+      </w:rPr>
+      <w:instrText xml:space="preserve"> NUMPAGES </w:instrText>
+    </w:r>
+    <w:r>
+      <w:rPr>
+        <w:sz w:val="20"/>
+        <w:szCs w:val="20"/>
+      </w:rPr>
+      <w:fldChar w:fldCharType="separate"/>
+    </w:r>
+    <w:r>
+      <w:rPr>
+        <w:sz w:val="20"/>
+        <w:szCs w:val="20"/>
+      </w:rPr>
+      <w:t>4</w:t>
+    </w:r>
+    <w:r>
+      <w:rPr>
+        <w:sz w:val="20"/>
+        <w:szCs w:val="20"/>
+      </w:rPr>
+      <w:fldChar w:fldCharType="end"/>
+    </w:r>
+    <w:bookmarkEnd w:id="0"/>
+  </w:p>
+</w:ftr>
+</file>
+
+<file path=word/footnotes.xml><?xml version="1.0" encoding="utf-8"?>
+<w:footnotes xmlns:o="urn:schemas-microsoft-com:office:office" xmlns:r="http://schemas.openxmlformats.org/officeDocument/2006/relationships" xmlns:v="urn:schemas-microsoft-com:vml" xmlns:w="http://schemas.openxmlformats.org/wordprocessingml/2006/main" xmlns:w10="urn:schemas-microsoft-com:office:word" xmlns:wp="http://schemas.openxmlformats.org/drawingml/2006/wordprocessingDrawing" xmlns:pic="http://schemas.openxmlformats.org/drawingml/2006/picture" xmlns:wps="http://schemas.microsoft.com/office/word/2010/wordprocessingShape" xmlns:wpg="http://schemas.microsoft.com/office/word/2010/wordprocessingGroup" xmlns:mc="http://schemas.openxmlformats.org/markup-compatibility/2006" xmlns:wp14="http://schemas.microsoft.com/office/word/2010/wordprocessingDrawing" xmlns:w14="http://schemas.microsoft.com/office/word/2010/wordml" xmlns:w15="http://schemas.microsoft.com/office/word/2012/wordml" mc:Ignorable="w14 wp14 w15">
+  <w:footnote w:id="0" w:type="separator">
+    <w:p>
+      <w:r>
+        <w:separator/>
+      </w:r>
+    </w:p>
+  </w:footnote>
+  <w:footnote w:id="1" w:type="continuationSeparator">
+    <w:p>
+      <w:r>
+        <w:continuationSeparator/>
+      </w:r>
+    </w:p>
+  </w:footnote>
+  <w:footnote w:id="2">
+    <w:p>
+      <w:pPr>
+        <w:pStyle w:val="FootnoteText"/>
+        <w:rPr/>
+      </w:pPr>
+      <w:r>
+        <w:rPr>
+          <w:rStyle w:val="FootnoteCharacters"/>
+        </w:rPr>
+        <w:footnoteRef/>
+      </w:r>
+      <w:r>
+        <w:rPr/>
+        <w:tab/>
+        <w:t xml:space="preserve"> </w:t>
+      </w:r>
+      <w:r>
+        <w:rPr/>
+        <w:t>EEG and Eye Tracking Signatures of Target Encoding during Structured Visual Search https://www.frontiersin.org/journals/human-neuroscience/articles/10.3389/fnhum.2017.00264/full</w:t>
+      </w:r>
+    </w:p>
+  </w:footnote>
+  <w:footnote w:id="3">
+    <w:p>
+      <w:pPr>
+        <w:pStyle w:val="FootnoteText"/>
+        <w:rPr/>
+      </w:pPr>
+      <w:r>
+        <w:rPr>
+          <w:rStyle w:val="FootnoteCharacters"/>
+        </w:rPr>
+        <w:footnoteRef/>
+      </w:r>
+      <w:r>
+        <w:rPr/>
+        <w:tab/>
+        <w:t xml:space="preserve"> </w:t>
+      </w:r>
+      <w:r>
+        <w:rPr/>
+        <w:t xml:space="preserve">Maryanne Wolf: Deep Reading a Tool for Attaining Empathy, Critical Thinking Skills </w:t>
+      </w:r>
+      <w:r>
+        <w:rPr/>
+        <w:t>b</w:t>
+      </w:r>
+      <w:r>
+        <w:rPr/>
+        <w:t>y Joanie Harmon - https://seis.ucla.edu/news/maryanne-wolf-deep-reading-a-tool-for-attaining-empathy-critical-thinking-skills/</w:t>
+      </w:r>
+    </w:p>
+  </w:footnote>
+  <w:footnote w:id="4">
+    <w:p>
+      <w:pPr>
+        <w:pStyle w:val="FootnoteText"/>
+        <w:rPr/>
+      </w:pPr>
+      <w:r>
+        <w:rPr>
+          <w:rStyle w:val="FootnoteCharacters"/>
+        </w:rPr>
+        <w:footnoteRef/>
+      </w:r>
+      <w:r>
+        <w:rPr/>
+        <w:tab/>
+        <w:t xml:space="preserve"> </w:t>
+      </w:r>
+      <w:r>
+        <w:rPr/>
+        <w:t>Researchers Identify Area Of The Brain That Processes Empathy https://www.mountsinai.org/about/newsroom/2012/researchers-identify-area-of-the-brain-that-processes-empathy</w:t>
+      </w:r>
+    </w:p>
+  </w:footnote>
+  <w:footnote w:id="5">
+    <w:p>
+      <w:pPr>
+        <w:pStyle w:val="FootnoteText"/>
+        <w:rPr/>
+      </w:pPr>
+      <w:r>
+        <w:rPr>
+          <w:rStyle w:val="FootnoteCharacters"/>
+        </w:rPr>
+        <w:footnoteRef/>
+      </w:r>
+      <w:r>
+        <w:rPr/>
+        <w:tab/>
+        <w:t xml:space="preserve"> </w:t>
+      </w:r>
+      <w:r>
+        <w:rPr/>
+        <w:t>Tips to improve concentration - https://www.health.harvard.edu/mind-and-mood/tips-to-improve-concentration</w:t>
+      </w:r>
+    </w:p>
+  </w:footnote>
+  <w:footnote w:id="6">
+    <w:p>
+      <w:pPr>
+        <w:pStyle w:val="FootnoteText"/>
+        <w:rPr/>
+      </w:pPr>
+      <w:r>
+        <w:rPr>
+          <w:rStyle w:val="FootnoteCharacters"/>
+        </w:rPr>
+        <w:footnoteRef/>
+      </w:r>
+      <w:r>
+        <w:rPr/>
+        <w:tab/>
+        <w:t xml:space="preserve"> </w:t>
+      </w:r>
+      <w:r>
+        <w:rPr/>
+        <w:t>How to Develop a Deep Reading Habit - https://thegrowtheq.com/how-to-develop-a-deep-reading-habit/</w:t>
+      </w:r>
+    </w:p>
+  </w:footnote>
+  <w:footnote w:id="7">
+    <w:p>
+      <w:pPr>
+        <w:pStyle w:val="FootnoteText"/>
+        <w:rPr/>
+      </w:pPr>
+      <w:r>
+        <w:rPr>
+          <w:rStyle w:val="FootnoteCharacters"/>
+        </w:rPr>
+        <w:footnoteRef/>
+      </w:r>
+      <w:r>
+        <w:rPr/>
+        <w:tab/>
+        <w:t xml:space="preserve"> </w:t>
+      </w:r>
+      <w:r>
+        <w:rPr/>
+        <w:t>How to rebuild your reading habits - https://www.popsci.com/health/how-to-rebuild-your-reading-habits/</w:t>
+      </w:r>
+    </w:p>
+  </w:footnote>
+</w:footnotes>
+</file>
+
 <file path=word/styles.xml><?xml version="1.0" encoding="utf-8"?>
 <w:styles xmlns:w="http://schemas.openxmlformats.org/wordprocessingml/2006/main" xmlns:w14="http://schemas.microsoft.com/office/word/2010/wordml" xmlns:mc="http://schemas.openxmlformats.org/markup-compatibility/2006" mc:Ignorable="w14">
   <w:docDefaults>
@@ -360,12 +698,51 @@
       <w:lang w:val="en-US" w:eastAsia="zh-CN" w:bidi="hi-IN"/>
     </w:rPr>
   </w:style>
+  <w:style w:type="paragraph" w:styleId="Heading1">
+    <w:name w:val="heading 1"/>
+    <w:basedOn w:val="Heading"/>
+    <w:next w:val="BodyText"/>
+    <w:qFormat/>
+    <w:pPr>
+      <w:spacing w:before="240" w:after="120"/>
+      <w:outlineLvl w:val="0"/>
+    </w:pPr>
+    <w:rPr>
+      <w:rFonts w:ascii="Liberation Serif" w:hAnsi="Liberation Serif" w:eastAsia="Songti SC" w:cs="Arial Unicode MS"/>
+      <w:b/>
+      <w:bCs/>
+      <w:sz w:val="48"/>
+      <w:szCs w:val="48"/>
+    </w:rPr>
+  </w:style>
   <w:style w:type="character" w:styleId="Hyperlink">
     <w:name w:val="Hyperlink"/>
     <w:rPr>
       <w:color w:val="000080"/>
       <w:u w:val="single"/>
     </w:rPr>
+  </w:style>
+  <w:style w:type="character" w:styleId="FootnoteCharacters">
+    <w:name w:val="Footnote Characters"/>
+    <w:qFormat/>
+    <w:rPr/>
+  </w:style>
+  <w:style w:type="character" w:styleId="FootnoteReference">
+    <w:name w:val="footnote reference"/>
+    <w:rPr>
+      <w:vertAlign w:val="superscript"/>
+    </w:rPr>
+  </w:style>
+  <w:style w:type="character" w:styleId="EndnoteReference">
+    <w:name w:val="endnote reference"/>
+    <w:rPr>
+      <w:vertAlign w:val="superscript"/>
+    </w:rPr>
+  </w:style>
+  <w:style w:type="character" w:styleId="EndnoteCharacters">
+    <w:name w:val="Endnote Characters"/>
+    <w:qFormat/>
+    <w:rPr/>
   </w:style>
   <w:style w:type="paragraph" w:styleId="Heading">
     <w:name w:val="Heading"/>
@@ -439,6 +816,40 @@
       <w:sz w:val="56"/>
       <w:szCs w:val="56"/>
     </w:rPr>
+  </w:style>
+  <w:style w:type="paragraph" w:styleId="FootnoteText">
+    <w:name w:val="footnote text"/>
+    <w:basedOn w:val="Normal"/>
+    <w:pPr>
+      <w:suppressLineNumbers/>
+      <w:ind w:hanging="340" w:left="340"/>
+    </w:pPr>
+    <w:rPr>
+      <w:sz w:val="20"/>
+      <w:szCs w:val="20"/>
+    </w:rPr>
+  </w:style>
+  <w:style w:type="paragraph" w:styleId="HeaderandFooter">
+    <w:name w:val="Header and Footer"/>
+    <w:basedOn w:val="Normal"/>
+    <w:qFormat/>
+    <w:pPr>
+      <w:suppressLineNumbers/>
+      <w:tabs>
+        <w:tab w:val="clear" w:pos="709"/>
+        <w:tab w:val="center" w:pos="4986" w:leader="none"/>
+        <w:tab w:val="right" w:pos="9972" w:leader="none"/>
+      </w:tabs>
+    </w:pPr>
+    <w:rPr/>
+  </w:style>
+  <w:style w:type="paragraph" w:styleId="Footer">
+    <w:name w:val="footer"/>
+    <w:basedOn w:val="HeaderandFooter"/>
+    <w:pPr>
+      <w:suppressLineNumbers/>
+    </w:pPr>
+    <w:rPr/>
   </w:style>
 </w:styles>
 </file>

</xml_diff>